<commit_message>
fixed mnl trip ticket
</commit_message>
<xml_diff>
--- a/report_template/trip-ticket_mnla.docx
+++ b/report_template/trip-ticket_mnla.docx
@@ -29,13 +29,15 @@
           <w:rFonts w:ascii="Arial" w:eastAsia="Arial" w:hAnsi="Arial" w:cs="Arial"/>
           <w:b/>
           <w:bCs/>
-        </w:rPr>
-      </w:pPr>
-      <w:r>
-        <w:rPr>
-          <w:rFonts w:ascii="Arial" w:eastAsia="Arial" w:hAnsi="Arial" w:cs="Arial"/>
-          <w:b/>
-          <w:bCs/>
+          <w:u w:val="single"/>
+        </w:rPr>
+      </w:pPr>
+      <w:r>
+        <w:rPr>
+          <w:rFonts w:ascii="Arial" w:eastAsia="Arial" w:hAnsi="Arial" w:cs="Arial"/>
+          <w:b/>
+          <w:bCs/>
+          <w:u w:val="single"/>
         </w:rPr>
         <w:t>{{DATE}}</w:t>
       </w:r>
@@ -43,6 +45,26 @@
     <w:p>
       <w:pPr>
         <w:spacing w:line="240" w:lineRule="auto"/>
+        <w:ind w:left="7920"/>
+        <w:jc w:val="both"/>
+        <w:rPr>
+          <w:rFonts w:ascii="Arial" w:eastAsia="Arial" w:hAnsi="Arial" w:cs="Arial"/>
+          <w:i/>
+          <w:iCs/>
+        </w:rPr>
+      </w:pPr>
+      <w:r>
+        <w:rPr>
+          <w:rFonts w:ascii="Arial" w:eastAsia="Arial" w:hAnsi="Arial" w:cs="Arial"/>
+          <w:i/>
+          <w:iCs/>
+        </w:rPr>
+        <w:t>(Date)</w:t>
+      </w:r>
+    </w:p>
+    <w:p>
+      <w:pPr>
+        <w:spacing w:line="240" w:lineRule="auto"/>
         <w:jc w:val="center"/>
         <w:rPr>
           <w:rFonts w:ascii="Arial" w:eastAsia="Arial" w:hAnsi="Arial" w:cs="Arial"/>
@@ -93,15 +115,7 @@
           <w:b/>
           <w:bCs/>
         </w:rPr>
-        <w:t>A.</w:t>
-      </w:r>
-      <w:r>
-        <w:rPr>
-          <w:rFonts w:ascii="Arial" w:eastAsia="Arial" w:hAnsi="Arial" w:cs="Arial"/>
-          <w:b/>
-          <w:bCs/>
-        </w:rPr>
-        <w:t xml:space="preserve"> To be filled up by the Administrative Official/s authorized to travel:</w:t>
+        <w:t>A. To be filled up by the Administrative Official/s authorized to travel:</w:t>
       </w:r>
     </w:p>
     <w:tbl>
@@ -141,6 +155,7 @@
             <w:pPr>
               <w:rPr>
                 <w:rFonts w:ascii="Arial" w:eastAsia="Arial" w:hAnsi="Arial" w:cs="Arial"/>
+                <w:lang w:val="en-US"/>
               </w:rPr>
             </w:pPr>
             <w:r>
@@ -153,6 +168,7 @@
             <w:r>
               <w:rPr>
                 <w:rFonts w:ascii="Arial" w:eastAsia="Arial" w:hAnsi="Arial" w:cs="Arial"/>
+                <w:lang w:val="en-US"/>
               </w:rPr>
               <w:t>driver_name</w:t>
             </w:r>
@@ -285,6 +301,12 @@
                 <w:rFonts w:ascii="Arial" w:eastAsia="Arial" w:hAnsi="Arial" w:cs="Arial"/>
               </w:rPr>
             </w:pPr>
+            <w:r>
+              <w:rPr>
+                <w:rFonts w:ascii="Arial" w:eastAsia="Arial" w:hAnsi="Arial" w:cs="Arial"/>
+              </w:rPr>
+              <w:t>{{destination}}</w:t>
+            </w:r>
           </w:p>
         </w:tc>
       </w:tr>
@@ -550,15 +572,7 @@
           <w:b/>
           <w:bCs/>
         </w:rPr>
-        <w:t>{</w:t>
-      </w:r>
-      <w:r>
-        <w:rPr>
-          <w:rFonts w:ascii="Arial" w:eastAsia="Arial" w:hAnsi="Arial" w:cs="Arial"/>
-          <w:b/>
-          <w:bCs/>
-        </w:rPr>
-        <w:t>{</w:t>
+        <w:t>{{</w:t>
       </w:r>
       <w:proofErr w:type="spellStart"/>
       <w:r>
@@ -636,15 +650,7 @@
           <w:b/>
           <w:bCs/>
         </w:rPr>
-        <w:t>{</w:t>
-      </w:r>
-      <w:r>
-        <w:rPr>
-          <w:rFonts w:ascii="Arial" w:eastAsia="Arial" w:hAnsi="Arial" w:cs="Arial"/>
-          <w:b/>
-          <w:bCs/>
-        </w:rPr>
-        <w:t>{</w:t>
+        <w:t>{{</w:t>
       </w:r>
       <w:proofErr w:type="spellStart"/>
       <w:r>
@@ -911,27 +917,7 @@
           <w:sz w:val="20"/>
           <w:szCs w:val="20"/>
         </w:rPr>
-        <w:t>B. To be filled</w:t>
-      </w:r>
-      <w:r>
-        <w:rPr>
-          <w:rFonts w:ascii="Arial" w:eastAsia="Arial" w:hAnsi="Arial" w:cs="Arial"/>
-          <w:b/>
-          <w:bCs/>
-          <w:sz w:val="20"/>
-          <w:szCs w:val="20"/>
-        </w:rPr>
-        <w:t xml:space="preserve"> up</w:t>
-      </w:r>
-      <w:r>
-        <w:rPr>
-          <w:rFonts w:ascii="Arial" w:eastAsia="Arial" w:hAnsi="Arial" w:cs="Arial"/>
-          <w:b/>
-          <w:bCs/>
-          <w:sz w:val="20"/>
-          <w:szCs w:val="20"/>
-        </w:rPr>
-        <w:t xml:space="preserve"> by the Driver:</w:t>
+        <w:t>B. To be filled up by the Driver:</w:t>
       </w:r>
     </w:p>
     <w:p>
@@ -1495,21 +1481,15 @@
           <w:rFonts w:ascii="Arial" w:eastAsia="Arial" w:hAnsi="Arial" w:cs="Arial"/>
           <w:sz w:val="20"/>
           <w:szCs w:val="20"/>
-        </w:rPr>
-      </w:pPr>
-      <w:r>
-        <w:rPr>
-          <w:rFonts w:ascii="Arial" w:eastAsia="Arial" w:hAnsi="Arial" w:cs="Arial"/>
-          <w:sz w:val="20"/>
-          <w:szCs w:val="20"/>
-        </w:rPr>
-        <w:t>___________</w:t>
-      </w:r>
-      <w:r>
-        <w:rPr>
-          <w:rFonts w:ascii="Arial" w:eastAsia="Arial" w:hAnsi="Arial" w:cs="Arial"/>
-          <w:sz w:val="20"/>
-          <w:szCs w:val="20"/>
+          <w:u w:val="single"/>
+        </w:rPr>
+      </w:pPr>
+      <w:r>
+        <w:rPr>
+          <w:rFonts w:ascii="Arial" w:eastAsia="Arial" w:hAnsi="Arial" w:cs="Arial"/>
+          <w:sz w:val="20"/>
+          <w:szCs w:val="20"/>
+          <w:u w:val="single"/>
         </w:rPr>
         <w:t>{{</w:t>
       </w:r>
@@ -1519,35 +1499,19 @@
           <w:rFonts w:ascii="Arial" w:eastAsia="Arial" w:hAnsi="Arial" w:cs="Arial"/>
           <w:sz w:val="20"/>
           <w:szCs w:val="20"/>
+          <w:u w:val="single"/>
         </w:rPr>
         <w:t>driver_name</w:t>
       </w:r>
       <w:proofErr w:type="spellEnd"/>
-      <w:proofErr w:type="gramStart"/>
-      <w:r>
-        <w:rPr>
-          <w:rFonts w:ascii="Arial" w:eastAsia="Arial" w:hAnsi="Arial" w:cs="Arial"/>
-          <w:sz w:val="20"/>
-          <w:szCs w:val="20"/>
+      <w:r>
+        <w:rPr>
+          <w:rFonts w:ascii="Arial" w:eastAsia="Arial" w:hAnsi="Arial" w:cs="Arial"/>
+          <w:sz w:val="20"/>
+          <w:szCs w:val="20"/>
+          <w:u w:val="single"/>
         </w:rPr>
         <w:t>}}</w:t>
-      </w:r>
-      <w:r>
-        <w:rPr>
-          <w:rFonts w:ascii="Arial" w:eastAsia="Arial" w:hAnsi="Arial" w:cs="Arial"/>
-          <w:sz w:val="20"/>
-          <w:szCs w:val="20"/>
-        </w:rPr>
-        <w:t>_</w:t>
-      </w:r>
-      <w:proofErr w:type="gramEnd"/>
-      <w:r>
-        <w:rPr>
-          <w:rFonts w:ascii="Arial" w:eastAsia="Arial" w:hAnsi="Arial" w:cs="Arial"/>
-          <w:sz w:val="20"/>
-          <w:szCs w:val="20"/>
-        </w:rPr>
-        <w:t>__________</w:t>
       </w:r>
     </w:p>
     <w:p>
@@ -2390,7 +2354,6 @@
   <w:style w:type="character" w:default="1" w:styleId="DefaultParagraphFont">
     <w:name w:val="Default Paragraph Font"/>
     <w:uiPriority w:val="1"/>
-    <w:semiHidden/>
     <w:unhideWhenUsed/>
   </w:style>
   <w:style w:type="table" w:default="1" w:styleId="TableNormal">

</xml_diff>